<commit_message>
MIG: fix short description duplication + clean metaDescription + column ordering
</commit_message>
<xml_diff>
--- a/sablony/stetce - dlouhy text en.docx
+++ b/sablony/stetce - dlouhy text en.docx
@@ -9,6 +9,7 @@
       <w:r>
         <w:rPr>
           <w:rtl w:val="0"/>
+          <w:lang w:val="en-US"/>
         </w:rPr>
         <w:t>&lt;!-- ===================== UNIVERSAL PRODUCT TEMPLATE ===================== --&gt;</w:t>
       </w:r>
@@ -20,6 +21,7 @@
       <w:r>
         <w:rPr>
           <w:rtl w:val="0"/>
+          <w:lang w:val="en-US"/>
         </w:rPr>
         <w:t>&lt;style&gt;&lt;!--</w:t>
       </w:r>
@@ -31,6 +33,7 @@
       <w:r>
         <w:rPr>
           <w:rtl w:val="0"/>
+          <w:lang w:val="en-US"/>
         </w:rPr>
         <w:t>body {</w:t>
       </w:r>
@@ -42,6 +45,7 @@
       <w:r>
         <w:rPr>
           <w:rtl w:val="0"/>
+          <w:lang w:val="en-US"/>
         </w:rPr>
         <w:t xml:space="preserve">  font-family: 'Inter', 'Helvetica Neue', sans-serif;</w:t>
       </w:r>
@@ -53,6 +57,7 @@
       <w:r>
         <w:rPr>
           <w:rtl w:val="0"/>
+          <w:lang w:val="en-US"/>
         </w:rPr>
         <w:t xml:space="preserve">  background-color: #fff;</w:t>
       </w:r>
@@ -64,6 +69,7 @@
       <w:r>
         <w:rPr>
           <w:rtl w:val="0"/>
+          <w:lang w:val="en-US"/>
         </w:rPr>
         <w:t xml:space="preserve">  color: #333;</w:t>
       </w:r>
@@ -75,6 +81,7 @@
       <w:r>
         <w:rPr>
           <w:rtl w:val="0"/>
+          <w:lang w:val="en-US"/>
         </w:rPr>
         <w:t xml:space="preserve">  line-height: 1.5;</w:t>
       </w:r>
@@ -86,6 +93,7 @@
       <w:r>
         <w:rPr>
           <w:rtl w:val="0"/>
+          <w:lang w:val="en-US"/>
         </w:rPr>
         <w:t xml:space="preserve">  margin: 0;</w:t>
       </w:r>
@@ -97,6 +105,7 @@
       <w:r>
         <w:rPr>
           <w:rtl w:val="0"/>
+          <w:lang w:val="en-US"/>
         </w:rPr>
         <w:t xml:space="preserve">  padding: 0;</w:t>
       </w:r>
@@ -108,6 +117,7 @@
       <w:r>
         <w:rPr>
           <w:rtl w:val="0"/>
+          <w:lang w:val="en-US"/>
         </w:rPr>
         <w:t>}</w:t>
       </w:r>
@@ -124,6 +134,7 @@
       <w:r>
         <w:rPr>
           <w:rtl w:val="0"/>
+          <w:lang w:val="en-US"/>
         </w:rPr>
         <w:t>h1, h2, h3 {</w:t>
       </w:r>
@@ -135,6 +146,7 @@
       <w:r>
         <w:rPr>
           <w:rtl w:val="0"/>
+          <w:lang w:val="en-US"/>
         </w:rPr>
         <w:t xml:space="preserve">  color: #004466;</w:t>
       </w:r>
@@ -146,6 +158,7 @@
       <w:r>
         <w:rPr>
           <w:rtl w:val="0"/>
+          <w:lang w:val="en-US"/>
         </w:rPr>
         <w:t xml:space="preserve">  font-weight: 700;</w:t>
       </w:r>
@@ -157,6 +170,7 @@
       <w:r>
         <w:rPr>
           <w:rtl w:val="0"/>
+          <w:lang w:val="en-US"/>
         </w:rPr>
         <w:t xml:space="preserve">  margin-top: 0;</w:t>
       </w:r>
@@ -168,6 +182,7 @@
       <w:r>
         <w:rPr>
           <w:rtl w:val="0"/>
+          <w:lang w:val="en-US"/>
         </w:rPr>
         <w:t xml:space="preserve">  margin-bottom: 12px;</w:t>
       </w:r>
@@ -179,6 +194,7 @@
       <w:r>
         <w:rPr>
           <w:rtl w:val="0"/>
+          <w:lang w:val="en-US"/>
         </w:rPr>
         <w:t>}</w:t>
       </w:r>
@@ -195,6 +211,7 @@
       <w:r>
         <w:rPr>
           <w:rtl w:val="0"/>
+          <w:lang w:val="en-US"/>
         </w:rPr>
         <w:t>h1 {</w:t>
       </w:r>
@@ -206,6 +223,7 @@
       <w:r>
         <w:rPr>
           <w:rtl w:val="0"/>
+          <w:lang w:val="en-US"/>
         </w:rPr>
         <w:t xml:space="preserve">  font-size: 36px;</w:t>
       </w:r>
@@ -217,6 +235,7 @@
       <w:r>
         <w:rPr>
           <w:rtl w:val="0"/>
+          <w:lang w:val="en-US"/>
         </w:rPr>
         <w:t xml:space="preserve">  text-align: center;</w:t>
       </w:r>
@@ -228,6 +247,7 @@
       <w:r>
         <w:rPr>
           <w:rtl w:val="0"/>
+          <w:lang w:val="en-US"/>
         </w:rPr>
         <w:t xml:space="preserve">  margin-top: 40px;</w:t>
       </w:r>
@@ -239,6 +259,7 @@
       <w:r>
         <w:rPr>
           <w:rtl w:val="0"/>
+          <w:lang w:val="en-US"/>
         </w:rPr>
         <w:t xml:space="preserve">  margin-bottom: 16px;</w:t>
       </w:r>
@@ -250,6 +271,7 @@
       <w:r>
         <w:rPr>
           <w:rtl w:val="0"/>
+          <w:lang w:val="en-US"/>
         </w:rPr>
         <w:t>}</w:t>
       </w:r>
@@ -266,6 +288,7 @@
       <w:r>
         <w:rPr>
           <w:rtl w:val="0"/>
+          <w:lang w:val="en-US"/>
         </w:rPr>
         <w:t>h2 {</w:t>
       </w:r>
@@ -277,6 +300,7 @@
       <w:r>
         <w:rPr>
           <w:rtl w:val="0"/>
+          <w:lang w:val="en-US"/>
         </w:rPr>
         <w:t xml:space="preserve">  font-size: 22px;</w:t>
       </w:r>
@@ -288,6 +312,7 @@
       <w:r>
         <w:rPr>
           <w:rtl w:val="0"/>
+          <w:lang w:val="en-US"/>
         </w:rPr>
         <w:t xml:space="preserve">  margin-top: 32px;</w:t>
       </w:r>
@@ -299,6 +324,7 @@
       <w:r>
         <w:rPr>
           <w:rtl w:val="0"/>
+          <w:lang w:val="en-US"/>
         </w:rPr>
         <w:t xml:space="preserve">  margin-bottom: 10px;</w:t>
       </w:r>
@@ -310,6 +336,7 @@
       <w:r>
         <w:rPr>
           <w:rtl w:val="0"/>
+          <w:lang w:val="en-US"/>
         </w:rPr>
         <w:t>}</w:t>
       </w:r>
@@ -326,6 +353,7 @@
       <w:r>
         <w:rPr>
           <w:rtl w:val="0"/>
+          <w:lang w:val="en-US"/>
         </w:rPr>
         <w:t>h3 {</w:t>
       </w:r>
@@ -337,6 +365,7 @@
       <w:r>
         <w:rPr>
           <w:rtl w:val="0"/>
+          <w:lang w:val="en-US"/>
         </w:rPr>
         <w:t xml:space="preserve">  font-size: 18px;</w:t>
       </w:r>
@@ -348,6 +377,7 @@
       <w:r>
         <w:rPr>
           <w:rtl w:val="0"/>
+          <w:lang w:val="en-US"/>
         </w:rPr>
         <w:t xml:space="preserve">  margin-top: 24px;</w:t>
       </w:r>
@@ -359,6 +389,7 @@
       <w:r>
         <w:rPr>
           <w:rtl w:val="0"/>
+          <w:lang w:val="en-US"/>
         </w:rPr>
         <w:t xml:space="preserve">  margin-bottom: 8px;</w:t>
       </w:r>
@@ -370,6 +401,7 @@
       <w:r>
         <w:rPr>
           <w:rtl w:val="0"/>
+          <w:lang w:val="en-US"/>
         </w:rPr>
         <w:t>}</w:t>
       </w:r>
@@ -386,6 +418,7 @@
       <w:r>
         <w:rPr>
           <w:rtl w:val="0"/>
+          <w:lang w:val="en-US"/>
         </w:rPr>
         <w:t>.section {</w:t>
       </w:r>
@@ -397,6 +430,7 @@
       <w:r>
         <w:rPr>
           <w:rtl w:val="0"/>
+          <w:lang w:val="en-US"/>
         </w:rPr>
         <w:t xml:space="preserve">  max-width: 1000px;</w:t>
       </w:r>
@@ -408,6 +442,7 @@
       <w:r>
         <w:rPr>
           <w:rtl w:val="0"/>
+          <w:lang w:val="en-US"/>
         </w:rPr>
         <w:t xml:space="preserve">  margin: 0 auto;</w:t>
       </w:r>
@@ -419,6 +454,7 @@
       <w:r>
         <w:rPr>
           <w:rtl w:val="0"/>
+          <w:lang w:val="en-US"/>
         </w:rPr>
         <w:t xml:space="preserve">  padding: 30px 20px;</w:t>
       </w:r>
@@ -430,6 +466,7 @@
       <w:r>
         <w:rPr>
           <w:rtl w:val="0"/>
+          <w:lang w:val="en-US"/>
         </w:rPr>
         <w:t>}</w:t>
       </w:r>
@@ -446,6 +483,7 @@
       <w:r>
         <w:rPr>
           <w:rtl w:val="0"/>
+          <w:lang w:val="en-US"/>
         </w:rPr>
         <w:t>.hero {</w:t>
       </w:r>
@@ -457,6 +495,7 @@
       <w:r>
         <w:rPr>
           <w:rtl w:val="0"/>
+          <w:lang w:val="en-US"/>
         </w:rPr>
         <w:t xml:space="preserve">  text-align: center;</w:t>
       </w:r>
@@ -468,6 +507,7 @@
       <w:r>
         <w:rPr>
           <w:rtl w:val="0"/>
+          <w:lang w:val="en-US"/>
         </w:rPr>
         <w:t xml:space="preserve">  padding: 60px 20px 30px;</w:t>
       </w:r>
@@ -479,6 +519,7 @@
       <w:r>
         <w:rPr>
           <w:rtl w:val="0"/>
+          <w:lang w:val="en-US"/>
         </w:rPr>
         <w:t>}</w:t>
       </w:r>
@@ -495,6 +536,7 @@
       <w:r>
         <w:rPr>
           <w:rtl w:val="0"/>
+          <w:lang w:val="en-US"/>
         </w:rPr>
         <w:t>.hero p {</w:t>
       </w:r>
@@ -506,6 +548,7 @@
       <w:r>
         <w:rPr>
           <w:rtl w:val="0"/>
+          <w:lang w:val="en-US"/>
         </w:rPr>
         <w:t xml:space="preserve">  font-size: 17px;</w:t>
       </w:r>
@@ -517,6 +560,7 @@
       <w:r>
         <w:rPr>
           <w:rtl w:val="0"/>
+          <w:lang w:val="en-US"/>
         </w:rPr>
         <w:t xml:space="preserve">  color: #555;</w:t>
       </w:r>
@@ -528,6 +572,7 @@
       <w:r>
         <w:rPr>
           <w:rtl w:val="0"/>
+          <w:lang w:val="en-US"/>
         </w:rPr>
         <w:t xml:space="preserve">  max-width: 700px;</w:t>
       </w:r>
@@ -539,6 +584,7 @@
       <w:r>
         <w:rPr>
           <w:rtl w:val="0"/>
+          <w:lang w:val="en-US"/>
         </w:rPr>
         <w:t xml:space="preserve">  margin: 0 auto;</w:t>
       </w:r>
@@ -550,6 +596,7 @@
       <w:r>
         <w:rPr>
           <w:rtl w:val="0"/>
+          <w:lang w:val="en-US"/>
         </w:rPr>
         <w:t>}</w:t>
       </w:r>
@@ -566,6 +613,7 @@
       <w:r>
         <w:rPr>
           <w:rtl w:val="0"/>
+          <w:lang w:val="en-US"/>
         </w:rPr>
         <w:t>.flex-row {</w:t>
       </w:r>
@@ -577,6 +625,7 @@
       <w:r>
         <w:rPr>
           <w:rtl w:val="0"/>
+          <w:lang w:val="en-US"/>
         </w:rPr>
         <w:t xml:space="preserve">  display: flex;</w:t>
       </w:r>
@@ -588,6 +637,7 @@
       <w:r>
         <w:rPr>
           <w:rtl w:val="0"/>
+          <w:lang w:val="en-US"/>
         </w:rPr>
         <w:t xml:space="preserve">  flex-wrap: wrap;</w:t>
       </w:r>
@@ -599,6 +649,7 @@
       <w:r>
         <w:rPr>
           <w:rtl w:val="0"/>
+          <w:lang w:val="en-US"/>
         </w:rPr>
         <w:t xml:space="preserve">  gap: 20px;</w:t>
       </w:r>
@@ -610,6 +661,7 @@
       <w:r>
         <w:rPr>
           <w:rtl w:val="0"/>
+          <w:lang w:val="en-US"/>
         </w:rPr>
         <w:t xml:space="preserve">  align-items: center;</w:t>
       </w:r>
@@ -621,6 +673,7 @@
       <w:r>
         <w:rPr>
           <w:rtl w:val="0"/>
+          <w:lang w:val="en-US"/>
         </w:rPr>
         <w:t xml:space="preserve">  justify-content: center;</w:t>
       </w:r>
@@ -632,6 +685,7 @@
       <w:r>
         <w:rPr>
           <w:rtl w:val="0"/>
+          <w:lang w:val="en-US"/>
         </w:rPr>
         <w:t xml:space="preserve">  margin-top: 20px;</w:t>
       </w:r>
@@ -643,6 +697,7 @@
       <w:r>
         <w:rPr>
           <w:rtl w:val="0"/>
+          <w:lang w:val="en-US"/>
         </w:rPr>
         <w:t>}</w:t>
       </w:r>
@@ -659,6 +714,7 @@
       <w:r>
         <w:rPr>
           <w:rtl w:val="0"/>
+          <w:lang w:val="en-US"/>
         </w:rPr>
         <w:t>.flex-row img {</w:t>
       </w:r>
@@ -670,6 +726,7 @@
       <w:r>
         <w:rPr>
           <w:rtl w:val="0"/>
+          <w:lang w:val="en-US"/>
         </w:rPr>
         <w:t xml:space="preserve">  max-width: 250px;</w:t>
       </w:r>
@@ -681,6 +738,7 @@
       <w:r>
         <w:rPr>
           <w:rtl w:val="0"/>
+          <w:lang w:val="en-US"/>
         </w:rPr>
         <w:t xml:space="preserve">  border-radius: 16px;</w:t>
       </w:r>
@@ -692,6 +750,7 @@
       <w:r>
         <w:rPr>
           <w:rtl w:val="0"/>
+          <w:lang w:val="en-US"/>
         </w:rPr>
         <w:t xml:space="preserve">  box-shadow: 0 8px 24px rgba(0,0,0,0.08);</w:t>
       </w:r>
@@ -703,6 +762,7 @@
       <w:r>
         <w:rPr>
           <w:rtl w:val="0"/>
+          <w:lang w:val="en-US"/>
         </w:rPr>
         <w:t xml:space="preserve">  transition: transform 0.3s ease;</w:t>
       </w:r>
@@ -714,6 +774,7 @@
       <w:r>
         <w:rPr>
           <w:rtl w:val="0"/>
+          <w:lang w:val="en-US"/>
         </w:rPr>
         <w:t>}</w:t>
       </w:r>
@@ -730,6 +791,7 @@
       <w:r>
         <w:rPr>
           <w:rtl w:val="0"/>
+          <w:lang w:val="en-US"/>
         </w:rPr>
         <w:t>.flex-row img:hover {</w:t>
       </w:r>
@@ -741,6 +803,7 @@
       <w:r>
         <w:rPr>
           <w:rtl w:val="0"/>
+          <w:lang w:val="en-US"/>
         </w:rPr>
         <w:t xml:space="preserve">  transform: scale(1.03);</w:t>
       </w:r>
@@ -752,6 +815,7 @@
       <w:r>
         <w:rPr>
           <w:rtl w:val="0"/>
+          <w:lang w:val="en-US"/>
         </w:rPr>
         <w:t>}</w:t>
       </w:r>
@@ -768,6 +832,7 @@
       <w:r>
         <w:rPr>
           <w:rtl w:val="0"/>
+          <w:lang w:val="en-US"/>
         </w:rPr>
         <w:t>.text-block {</w:t>
       </w:r>
@@ -779,6 +844,7 @@
       <w:r>
         <w:rPr>
           <w:rtl w:val="0"/>
+          <w:lang w:val="en-US"/>
         </w:rPr>
         <w:t xml:space="preserve">  font-size: 16px;</w:t>
       </w:r>
@@ -790,6 +856,7 @@
       <w:r>
         <w:rPr>
           <w:rtl w:val="0"/>
+          <w:lang w:val="en-US"/>
         </w:rPr>
         <w:t xml:space="preserve">  color: #555;</w:t>
       </w:r>
@@ -801,6 +868,7 @@
       <w:r>
         <w:rPr>
           <w:rtl w:val="0"/>
+          <w:lang w:val="en-US"/>
         </w:rPr>
         <w:t xml:space="preserve">  line-height: 1.6;</w:t>
       </w:r>
@@ -812,6 +880,7 @@
       <w:r>
         <w:rPr>
           <w:rtl w:val="0"/>
+          <w:lang w:val="en-US"/>
         </w:rPr>
         <w:t xml:space="preserve">  margin-top: 12px;</w:t>
       </w:r>
@@ -823,6 +892,7 @@
       <w:r>
         <w:rPr>
           <w:rtl w:val="0"/>
+          <w:lang w:val="en-US"/>
         </w:rPr>
         <w:t>}</w:t>
       </w:r>
@@ -839,6 +909,7 @@
       <w:r>
         <w:rPr>
           <w:rtl w:val="0"/>
+          <w:lang w:val="en-US"/>
         </w:rPr>
         <w:t>.card-table {</w:t>
       </w:r>
@@ -850,6 +921,7 @@
       <w:r>
         <w:rPr>
           <w:rtl w:val="0"/>
+          <w:lang w:val="en-US"/>
         </w:rPr>
         <w:t xml:space="preserve">  background: #fff;</w:t>
       </w:r>
@@ -861,6 +933,7 @@
       <w:r>
         <w:rPr>
           <w:rtl w:val="0"/>
+          <w:lang w:val="en-US"/>
         </w:rPr>
         <w:t xml:space="preserve">  border-radius: 16px;</w:t>
       </w:r>
@@ -872,6 +945,7 @@
       <w:r>
         <w:rPr>
           <w:rtl w:val="0"/>
+          <w:lang w:val="en-US"/>
         </w:rPr>
         <w:t xml:space="preserve">  box-shadow: 0 8px 24px rgba(0,0,0,0.06);</w:t>
       </w:r>
@@ -883,6 +957,7 @@
       <w:r>
         <w:rPr>
           <w:rtl w:val="0"/>
+          <w:lang w:val="en-US"/>
         </w:rPr>
         <w:t xml:space="preserve">  padding: 16px;</w:t>
       </w:r>
@@ -894,6 +969,7 @@
       <w:r>
         <w:rPr>
           <w:rtl w:val="0"/>
+          <w:lang w:val="en-US"/>
         </w:rPr>
         <w:t xml:space="preserve">  margin-top: 16px;</w:t>
       </w:r>
@@ -905,6 +981,7 @@
       <w:r>
         <w:rPr>
           <w:rtl w:val="0"/>
+          <w:lang w:val="en-US"/>
         </w:rPr>
         <w:t>}</w:t>
       </w:r>
@@ -921,6 +998,7 @@
       <w:r>
         <w:rPr>
           <w:rtl w:val="0"/>
+          <w:lang w:val="en-US"/>
         </w:rPr>
         <w:t>.card-table table {</w:t>
       </w:r>
@@ -932,6 +1010,7 @@
       <w:r>
         <w:rPr>
           <w:rtl w:val="0"/>
+          <w:lang w:val="en-US"/>
         </w:rPr>
         <w:t xml:space="preserve">  width: 100%;</w:t>
       </w:r>
@@ -943,6 +1022,7 @@
       <w:r>
         <w:rPr>
           <w:rtl w:val="0"/>
+          <w:lang w:val="en-US"/>
         </w:rPr>
         <w:t xml:space="preserve">  border-collapse: collapse;</w:t>
       </w:r>
@@ -954,6 +1034,7 @@
       <w:r>
         <w:rPr>
           <w:rtl w:val="0"/>
+          <w:lang w:val="en-US"/>
         </w:rPr>
         <w:t xml:space="preserve">  font-size: 15px;</w:t>
       </w:r>
@@ -965,6 +1046,7 @@
       <w:r>
         <w:rPr>
           <w:rtl w:val="0"/>
+          <w:lang w:val="en-US"/>
         </w:rPr>
         <w:t>}</w:t>
       </w:r>
@@ -981,6 +1063,7 @@
       <w:r>
         <w:rPr>
           <w:rtl w:val="0"/>
+          <w:lang w:val="en-US"/>
         </w:rPr>
         <w:t>.card-table th, .card-table td {</w:t>
       </w:r>
@@ -992,6 +1075,7 @@
       <w:r>
         <w:rPr>
           <w:rtl w:val="0"/>
+          <w:lang w:val="en-US"/>
         </w:rPr>
         <w:t xml:space="preserve">  padding: 10px;</w:t>
       </w:r>
@@ -1003,6 +1087,7 @@
       <w:r>
         <w:rPr>
           <w:rtl w:val="0"/>
+          <w:lang w:val="en-US"/>
         </w:rPr>
         <w:t xml:space="preserve">  text-align: left;</w:t>
       </w:r>
@@ -1014,6 +1099,7 @@
       <w:r>
         <w:rPr>
           <w:rtl w:val="0"/>
+          <w:lang w:val="en-US"/>
         </w:rPr>
         <w:t>}</w:t>
       </w:r>
@@ -1030,6 +1116,7 @@
       <w:r>
         <w:rPr>
           <w:rtl w:val="0"/>
+          <w:lang w:val="en-US"/>
         </w:rPr>
         <w:t>.card-table th {</w:t>
       </w:r>
@@ -1041,6 +1128,7 @@
       <w:r>
         <w:rPr>
           <w:rtl w:val="0"/>
+          <w:lang w:val="en-US"/>
         </w:rPr>
         <w:t xml:space="preserve">  background-color: #f0f0f0;</w:t>
       </w:r>
@@ -1052,6 +1140,7 @@
       <w:r>
         <w:rPr>
           <w:rtl w:val="0"/>
+          <w:lang w:val="en-US"/>
         </w:rPr>
         <w:t xml:space="preserve">  border-bottom: 1px solid #ddd;</w:t>
       </w:r>
@@ -1063,6 +1152,7 @@
       <w:r>
         <w:rPr>
           <w:rtl w:val="0"/>
+          <w:lang w:val="en-US"/>
         </w:rPr>
         <w:t>}</w:t>
       </w:r>
@@ -1079,6 +1169,7 @@
       <w:r>
         <w:rPr>
           <w:rtl w:val="0"/>
+          <w:lang w:val="en-US"/>
         </w:rPr>
         <w:t>.card-table td {</w:t>
       </w:r>
@@ -1090,6 +1181,7 @@
       <w:r>
         <w:rPr>
           <w:rtl w:val="0"/>
+          <w:lang w:val="en-US"/>
         </w:rPr>
         <w:t xml:space="preserve">  border-bottom: 1px solid #eee;</w:t>
       </w:r>
@@ -1101,6 +1193,7 @@
       <w:r>
         <w:rPr>
           <w:rtl w:val="0"/>
+          <w:lang w:val="en-US"/>
         </w:rPr>
         <w:t>}</w:t>
       </w:r>
@@ -1117,6 +1210,7 @@
       <w:r>
         <w:rPr>
           <w:rtl w:val="0"/>
+          <w:lang w:val="en-US"/>
         </w:rPr>
         <w:t>ul {</w:t>
       </w:r>
@@ -1128,6 +1222,7 @@
       <w:r>
         <w:rPr>
           <w:rtl w:val="0"/>
+          <w:lang w:val="en-US"/>
         </w:rPr>
         <w:t xml:space="preserve">  padding-left: 20px;</w:t>
       </w:r>
@@ -1139,6 +1234,7 @@
       <w:r>
         <w:rPr>
           <w:rtl w:val="0"/>
+          <w:lang w:val="en-US"/>
         </w:rPr>
         <w:t xml:space="preserve">  line-height: 1.5;</w:t>
       </w:r>
@@ -1150,6 +1246,7 @@
       <w:r>
         <w:rPr>
           <w:rtl w:val="0"/>
+          <w:lang w:val="en-US"/>
         </w:rPr>
         <w:t xml:space="preserve">  margin: 8px 0;</w:t>
       </w:r>
@@ -1161,6 +1258,7 @@
       <w:r>
         <w:rPr>
           <w:rtl w:val="0"/>
+          <w:lang w:val="en-US"/>
         </w:rPr>
         <w:t>}</w:t>
       </w:r>
@@ -1177,6 +1275,7 @@
       <w:r>
         <w:rPr>
           <w:rtl w:val="0"/>
+          <w:lang w:val="en-US"/>
         </w:rPr>
         <w:t>.video-block {</w:t>
       </w:r>
@@ -1188,6 +1287,7 @@
       <w:r>
         <w:rPr>
           <w:rtl w:val="0"/>
+          <w:lang w:val="en-US"/>
         </w:rPr>
         <w:t xml:space="preserve">  position: relative;</w:t>
       </w:r>
@@ -1199,6 +1299,7 @@
       <w:r>
         <w:rPr>
           <w:rtl w:val="0"/>
+          <w:lang w:val="en-US"/>
         </w:rPr>
         <w:t xml:space="preserve">  padding-bottom: 56.25%;</w:t>
       </w:r>
@@ -1210,6 +1311,7 @@
       <w:r>
         <w:rPr>
           <w:rtl w:val="0"/>
+          <w:lang w:val="en-US"/>
         </w:rPr>
         <w:t xml:space="preserve">  height: 0;</w:t>
       </w:r>
@@ -1221,6 +1323,7 @@
       <w:r>
         <w:rPr>
           <w:rtl w:val="0"/>
+          <w:lang w:val="en-US"/>
         </w:rPr>
         <w:t xml:space="preserve">  overflow: hidden;</w:t>
       </w:r>
@@ -1232,6 +1335,7 @@
       <w:r>
         <w:rPr>
           <w:rtl w:val="0"/>
+          <w:lang w:val="en-US"/>
         </w:rPr>
         <w:t xml:space="preserve">  border-radius: 16px;</w:t>
       </w:r>
@@ -1243,6 +1347,7 @@
       <w:r>
         <w:rPr>
           <w:rtl w:val="0"/>
+          <w:lang w:val="en-US"/>
         </w:rPr>
         <w:t xml:space="preserve">  margin-top: 24px;</w:t>
       </w:r>
@@ -1254,6 +1359,7 @@
       <w:r>
         <w:rPr>
           <w:rtl w:val="0"/>
+          <w:lang w:val="en-US"/>
         </w:rPr>
         <w:t>}</w:t>
       </w:r>
@@ -1270,6 +1376,7 @@
       <w:r>
         <w:rPr>
           <w:rtl w:val="0"/>
+          <w:lang w:val="en-US"/>
         </w:rPr>
         <w:t>.video-block iframe {</w:t>
       </w:r>
@@ -1281,6 +1388,7 @@
       <w:r>
         <w:rPr>
           <w:rtl w:val="0"/>
+          <w:lang w:val="en-US"/>
         </w:rPr>
         <w:t xml:space="preserve">  position: absolute;</w:t>
       </w:r>
@@ -1292,6 +1400,7 @@
       <w:r>
         <w:rPr>
           <w:rtl w:val="0"/>
+          <w:lang w:val="en-US"/>
         </w:rPr>
         <w:t xml:space="preserve">  top: 0;</w:t>
       </w:r>
@@ -1303,6 +1412,7 @@
       <w:r>
         <w:rPr>
           <w:rtl w:val="0"/>
+          <w:lang w:val="en-US"/>
         </w:rPr>
         <w:t xml:space="preserve">  left: 0;</w:t>
       </w:r>
@@ -1314,6 +1424,7 @@
       <w:r>
         <w:rPr>
           <w:rtl w:val="0"/>
+          <w:lang w:val="en-US"/>
         </w:rPr>
         <w:t xml:space="preserve">  width: 100%;</w:t>
       </w:r>
@@ -1325,6 +1436,7 @@
       <w:r>
         <w:rPr>
           <w:rtl w:val="0"/>
+          <w:lang w:val="en-US"/>
         </w:rPr>
         <w:t xml:space="preserve">  height: 100%;</w:t>
       </w:r>
@@ -1336,6 +1448,7 @@
       <w:r>
         <w:rPr>
           <w:rtl w:val="0"/>
+          <w:lang w:val="en-US"/>
         </w:rPr>
         <w:t xml:space="preserve">  border-radius: 16px;</w:t>
       </w:r>
@@ -1347,6 +1460,7 @@
       <w:r>
         <w:rPr>
           <w:rtl w:val="0"/>
+          <w:lang w:val="en-US"/>
         </w:rPr>
         <w:t>}</w:t>
       </w:r>
@@ -1363,6 +1477,7 @@
       <w:r>
         <w:rPr>
           <w:rtl w:val="0"/>
+          <w:lang w:val="en-US"/>
         </w:rPr>
         <w:t>hr {</w:t>
       </w:r>
@@ -1374,6 +1489,7 @@
       <w:r>
         <w:rPr>
           <w:rtl w:val="0"/>
+          <w:lang w:val="en-US"/>
         </w:rPr>
         <w:t xml:space="preserve">  border: none;</w:t>
       </w:r>
@@ -1385,6 +1501,7 @@
       <w:r>
         <w:rPr>
           <w:rtl w:val="0"/>
+          <w:lang w:val="en-US"/>
         </w:rPr>
         <w:t xml:space="preserve">  height: 1px;</w:t>
       </w:r>
@@ -1396,6 +1513,7 @@
       <w:r>
         <w:rPr>
           <w:rtl w:val="0"/>
+          <w:lang w:val="en-US"/>
         </w:rPr>
         <w:t xml:space="preserve">  background: linear-gradient(to right, transparent, #ccc, transparent);</w:t>
       </w:r>
@@ -1407,6 +1525,7 @@
       <w:r>
         <w:rPr>
           <w:rtl w:val="0"/>
+          <w:lang w:val="en-US"/>
         </w:rPr>
         <w:t xml:space="preserve">  margin: 40px 0;</w:t>
       </w:r>
@@ -1418,6 +1537,7 @@
       <w:r>
         <w:rPr>
           <w:rtl w:val="0"/>
+          <w:lang w:val="en-US"/>
         </w:rPr>
         <w:t>}</w:t>
       </w:r>
@@ -1429,6 +1549,7 @@
       <w:r>
         <w:rPr>
           <w:rtl w:val="0"/>
+          <w:lang w:val="en-US"/>
         </w:rPr>
         <w:t>--&gt;&lt;/style&gt;</w:t>
       </w:r>
@@ -1445,6 +1566,7 @@
       <w:r>
         <w:rPr>
           <w:rtl w:val="0"/>
+          <w:lang w:val="en-US"/>
         </w:rPr>
         <w:t>&lt;!-- HERO --&gt;</w:t>
       </w:r>
@@ -1456,6 +1578,7 @@
       <w:r>
         <w:rPr>
           <w:rtl w:val="0"/>
+          <w:lang w:val="en-US"/>
         </w:rPr>
         <w:t>&lt;div class="hero"&gt;</w:t>
       </w:r>
@@ -1467,6 +1590,7 @@
       <w:r>
         <w:rPr>
           <w:rtl w:val="0"/>
+          <w:lang w:val="en-US"/>
         </w:rPr>
         <w:t>&lt;h1&gt;{nazev_produktu}&lt;/h1&gt;</w:t>
       </w:r>
@@ -1478,6 +1602,7 @@
       <w:r>
         <w:rPr>
           <w:rtl w:val="0"/>
+          <w:lang w:val="en-US"/>
         </w:rPr>
         <w:t>&lt;p&gt;{strucny_popis_produktu}&lt;/p&gt;</w:t>
       </w:r>
@@ -1489,6 +1614,7 @@
       <w:r>
         <w:rPr>
           <w:rtl w:val="0"/>
+          <w:lang w:val="en-US"/>
         </w:rPr>
         <w:t>&lt;/div&gt;</w:t>
       </w:r>
@@ -1505,6 +1631,7 @@
       <w:r>
         <w:rPr>
           <w:rtl w:val="0"/>
+          <w:lang w:val="en-US"/>
         </w:rPr>
         <w:t>&lt;!-- INTRO + IMAGE --&gt;</w:t>
       </w:r>
@@ -1516,6 +1643,7 @@
       <w:r>
         <w:rPr>
           <w:rtl w:val="0"/>
+          <w:lang w:val="en-US"/>
         </w:rPr>
         <w:t>&lt;div class="section flex-row"&gt;</w:t>
       </w:r>
@@ -1527,6 +1655,7 @@
       <w:r>
         <w:rPr>
           <w:rtl w:val="0"/>
+          <w:lang w:val="en-US"/>
         </w:rPr>
         <w:t>&lt;div style="flex: 1; min-width: 280px;"&gt;</w:t>
       </w:r>
@@ -1538,6 +1667,7 @@
       <w:r>
         <w:rPr>
           <w:rtl w:val="0"/>
+          <w:lang w:val="en-US"/>
         </w:rPr>
         <w:t>&lt;p&gt;&lt;strong&gt;{nazev_produktu}&lt;/strong&gt; is a {typ_produktu} suitable for &lt;em&gt;{doporucene_pouziti}&lt;/em&gt;. &lt;em&gt;{hlavni_vlastnosti}.&lt;/em&gt; &lt;em&gt;{konkretni_aplikace}.&lt;/em&gt;&lt;/p&gt;</w:t>
       </w:r>
@@ -1549,6 +1679,7 @@
       <w:r>
         <w:rPr>
           <w:rtl w:val="0"/>
+          <w:lang w:val="en-US"/>
         </w:rPr>
         <w:t>&lt;/div&gt;</w:t>
       </w:r>
@@ -1560,6 +1691,7 @@
       <w:r>
         <w:rPr>
           <w:rtl w:val="0"/>
+          <w:lang w:val="en-US"/>
         </w:rPr>
         <w:t>&lt;img src="{img1_src}" alt="{nazev_produktu}" width="250" height="auto" /&gt;</w:t>
       </w:r>
@@ -1571,6 +1703,7 @@
       <w:r>
         <w:rPr>
           <w:rtl w:val="0"/>
+          <w:lang w:val="en-US"/>
         </w:rPr>
         <w:t>&lt;/div&gt;</w:t>
       </w:r>
@@ -1587,6 +1720,7 @@
       <w:r>
         <w:rPr>
           <w:rtl w:val="0"/>
+          <w:lang w:val="en-US"/>
         </w:rPr>
         <w:t>&lt;!-- ABOUT --&gt;</w:t>
       </w:r>
@@ -1598,6 +1732,7 @@
       <w:r>
         <w:rPr>
           <w:rtl w:val="0"/>
+          <w:lang w:val="en-US"/>
         </w:rPr>
         <w:t>&lt;div class="section"&gt;</w:t>
       </w:r>
@@ -1609,6 +1744,7 @@
       <w:r>
         <w:rPr>
           <w:rtl w:val="0"/>
+          <w:lang w:val="en-US"/>
         </w:rPr>
         <w:t>&lt;h2&gt;About the product&lt;/h2&gt;</w:t>
       </w:r>
@@ -1620,6 +1756,7 @@
       <w:r>
         <w:rPr>
           <w:rtl w:val="0"/>
+          <w:lang w:val="en-US"/>
         </w:rPr>
         <w:t>&lt;div class="text-block"&gt;</w:t>
       </w:r>
@@ -1631,6 +1768,7 @@
       <w:r>
         <w:rPr>
           <w:rtl w:val="0"/>
+          <w:lang w:val="en-US"/>
         </w:rPr>
         <w:t>&lt;p&gt;{podrobnejsi_popis_produktu}&lt;/p&gt;</w:t>
       </w:r>
@@ -1642,6 +1780,7 @@
       <w:r>
         <w:rPr>
           <w:rtl w:val="0"/>
+          <w:lang w:val="en-US"/>
         </w:rPr>
         <w:t>&lt;/div&gt;</w:t>
       </w:r>
@@ -1653,6 +1792,7 @@
       <w:r>
         <w:rPr>
           <w:rtl w:val="0"/>
+          <w:lang w:val="en-US"/>
         </w:rPr>
         <w:t>&lt;/div&gt;</w:t>
       </w:r>
@@ -1669,6 +1809,7 @@
       <w:r>
         <w:rPr>
           <w:rtl w:val="0"/>
+          <w:lang w:val="en-US"/>
         </w:rPr>
         <w:t>&lt;!-- CATEGORY --&gt;</w:t>
       </w:r>
@@ -1680,6 +1821,7 @@
       <w:r>
         <w:rPr>
           <w:rtl w:val="0"/>
+          <w:lang w:val="en-US"/>
         </w:rPr>
         <w:t>&lt;div class="section"&gt;</w:t>
       </w:r>
@@ -1691,6 +1833,7 @@
       <w:r>
         <w:rPr>
           <w:rtl w:val="0"/>
+          <w:lang w:val="en-US"/>
         </w:rPr>
         <w:t>&lt;h2&gt;Where does it belong?&lt;/h2&gt;</w:t>
       </w:r>
@@ -1702,6 +1845,7 @@
       <w:r>
         <w:rPr>
           <w:rtl w:val="0"/>
+          <w:lang w:val="en-US"/>
         </w:rPr>
         <w:t>&lt;div class="text-block"&gt;</w:t>
       </w:r>
@@ -1713,6 +1857,7 @@
       <w:r>
         <w:rPr>
           <w:rtl w:val="0"/>
+          <w:lang w:val="en-US"/>
         </w:rPr>
         <w:t>&lt;p&gt;{zarazeni_produktu_a_rada}&lt;/p&gt;</w:t>
       </w:r>
@@ -1724,6 +1869,7 @@
       <w:r>
         <w:rPr>
           <w:rtl w:val="0"/>
+          <w:lang w:val="en-US"/>
         </w:rPr>
         <w:t>&lt;/div&gt;</w:t>
       </w:r>
@@ -1735,6 +1881,7 @@
       <w:r>
         <w:rPr>
           <w:rtl w:val="0"/>
+          <w:lang w:val="en-US"/>
         </w:rPr>
         <w:t>&lt;/div&gt;</w:t>
       </w:r>
@@ -1751,6 +1898,7 @@
       <w:r>
         <w:rPr>
           <w:rtl w:val="0"/>
+          <w:lang w:val="en-US"/>
         </w:rPr>
         <w:t>&lt;!-- FEATURES --&gt;</w:t>
       </w:r>
@@ -1762,6 +1910,7 @@
       <w:r>
         <w:rPr>
           <w:rtl w:val="0"/>
+          <w:lang w:val="en-US"/>
         </w:rPr>
         <w:t>&lt;div class="section"&gt;</w:t>
       </w:r>
@@ -1773,6 +1922,7 @@
       <w:r>
         <w:rPr>
           <w:rtl w:val="0"/>
+          <w:lang w:val="en-US"/>
         </w:rPr>
         <w:t>&lt;h2&gt;Features&lt;/h2&gt;</w:t>
       </w:r>
@@ -1784,6 +1934,7 @@
       <w:r>
         <w:rPr>
           <w:rtl w:val="0"/>
+          <w:lang w:val="en-US"/>
         </w:rPr>
         <w:t>&lt;ul&gt;</w:t>
       </w:r>
@@ -1795,6 +1946,7 @@
       <w:r>
         <w:rPr>
           <w:rtl w:val="0"/>
+          <w:lang w:val="en-US"/>
         </w:rPr>
         <w:t>&lt;li&gt;{vlastnost_1}&lt;/li&gt;</w:t>
       </w:r>
@@ -1806,6 +1958,7 @@
       <w:r>
         <w:rPr>
           <w:rtl w:val="0"/>
+          <w:lang w:val="en-US"/>
         </w:rPr>
         <w:t>&lt;li&gt;{vlastnost_2}&lt;/li&gt;</w:t>
       </w:r>
@@ -1817,6 +1970,7 @@
       <w:r>
         <w:rPr>
           <w:rtl w:val="0"/>
+          <w:lang w:val="en-US"/>
         </w:rPr>
         <w:t>&lt;li&gt;{vlastnost_3}&lt;/li&gt;</w:t>
       </w:r>
@@ -1828,6 +1982,7 @@
       <w:r>
         <w:rPr>
           <w:rtl w:val="0"/>
+          <w:lang w:val="en-US"/>
         </w:rPr>
         <w:t>&lt;/ul&gt;</w:t>
       </w:r>
@@ -1839,6 +1994,7 @@
       <w:r>
         <w:rPr>
           <w:rtl w:val="0"/>
+          <w:lang w:val="en-US"/>
         </w:rPr>
         <w:t>&lt;/div&gt;</w:t>
       </w:r>
@@ -1855,6 +2011,7 @@
       <w:r>
         <w:rPr>
           <w:rtl w:val="0"/>
+          <w:lang w:val="en-US"/>
         </w:rPr>
         <w:t>&lt;!-- TIPS --&gt;</w:t>
       </w:r>
@@ -1866,6 +2023,7 @@
       <w:r>
         <w:rPr>
           <w:rtl w:val="0"/>
+          <w:lang w:val="en-US"/>
         </w:rPr>
         <w:t>&lt;div class="section"&gt;</w:t>
       </w:r>
@@ -1877,6 +2035,7 @@
       <w:r>
         <w:rPr>
           <w:rtl w:val="0"/>
+          <w:lang w:val="en-US"/>
         </w:rPr>
         <w:t>&lt;h2&gt;Tips and tricks&lt;/h2&gt;</w:t>
       </w:r>
@@ -1888,6 +2047,7 @@
       <w:r>
         <w:rPr>
           <w:rtl w:val="0"/>
+          <w:lang w:val="en-US"/>
         </w:rPr>
         <w:t>&lt;div class="card-table"&gt;</w:t>
       </w:r>
@@ -1899,6 +2059,7 @@
       <w:r>
         <w:rPr>
           <w:rtl w:val="0"/>
+          <w:lang w:val="en-US"/>
         </w:rPr>
         <w:t>&lt;table&gt;</w:t>
       </w:r>
@@ -1910,6 +2071,7 @@
       <w:r>
         <w:rPr>
           <w:rtl w:val="0"/>
+          <w:lang w:val="en-US"/>
         </w:rPr>
         <w:t>&lt;tbody&gt;</w:t>
       </w:r>
@@ -1921,6 +2083,7 @@
       <w:r>
         <w:rPr>
           <w:rtl w:val="0"/>
+          <w:lang w:val="en-US"/>
         </w:rPr>
         <w:t>&lt;tr&gt;</w:t>
       </w:r>
@@ -1932,6 +2095,7 @@
       <w:r>
         <w:rPr>
           <w:rtl w:val="0"/>
+          <w:lang w:val="en-US"/>
         </w:rPr>
         <w:t>&lt;th&gt;Category&lt;/th&gt;</w:t>
       </w:r>
@@ -1943,6 +2107,7 @@
       <w:r>
         <w:rPr>
           <w:rtl w:val="0"/>
+          <w:lang w:val="en-US"/>
         </w:rPr>
         <w:t>&lt;th&gt;Description&lt;/th&gt;</w:t>
       </w:r>
@@ -1954,6 +2119,7 @@
       <w:r>
         <w:rPr>
           <w:rtl w:val="0"/>
+          <w:lang w:val="en-US"/>
         </w:rPr>
         <w:t>&lt;/tr&gt;</w:t>
       </w:r>
@@ -1965,6 +2131,7 @@
       <w:r>
         <w:rPr>
           <w:rtl w:val="0"/>
+          <w:lang w:val="en-US"/>
         </w:rPr>
         <w:t>&lt;tr&gt;</w:t>
       </w:r>
@@ -1976,6 +2143,7 @@
       <w:r>
         <w:rPr>
           <w:rtl w:val="0"/>
+          <w:lang w:val="en-US"/>
         </w:rPr>
         <w:t>&lt;td&gt;Use&lt;/td&gt;</w:t>
       </w:r>
@@ -1987,6 +2155,7 @@
       <w:r>
         <w:rPr>
           <w:rtl w:val="0"/>
+          <w:lang w:val="en-US"/>
         </w:rPr>
         <w:t>&lt;td&gt;{doporucene_pouziti_tabulka}&lt;/td&gt;</w:t>
       </w:r>
@@ -1998,6 +2167,7 @@
       <w:r>
         <w:rPr>
           <w:rtl w:val="0"/>
+          <w:lang w:val="en-US"/>
         </w:rPr>
         <w:t>&lt;/tr&gt;</w:t>
       </w:r>
@@ -2009,6 +2179,7 @@
       <w:r>
         <w:rPr>
           <w:rtl w:val="0"/>
+          <w:lang w:val="en-US"/>
         </w:rPr>
         <w:t>&lt;tr&gt;</w:t>
       </w:r>
@@ -2020,6 +2191,7 @@
       <w:r>
         <w:rPr>
           <w:rtl w:val="0"/>
+          <w:lang w:val="en-US"/>
         </w:rPr>
         <w:t>&lt;td&gt;Advantages&lt;/td&gt;</w:t>
       </w:r>
@@ -2031,6 +2203,7 @@
       <w:r>
         <w:rPr>
           <w:rtl w:val="0"/>
+          <w:lang w:val="en-US"/>
         </w:rPr>
         <w:t>&lt;td&gt;{vyhody}&lt;/td&gt;</w:t>
       </w:r>
@@ -2042,6 +2215,7 @@
       <w:r>
         <w:rPr>
           <w:rtl w:val="0"/>
+          <w:lang w:val="en-US"/>
         </w:rPr>
         <w:t>&lt;/tr&gt;</w:t>
       </w:r>
@@ -2053,6 +2227,7 @@
       <w:r>
         <w:rPr>
           <w:rtl w:val="0"/>
+          <w:lang w:val="en-US"/>
         </w:rPr>
         <w:t>&lt;tr&gt;</w:t>
       </w:r>
@@ -2064,6 +2239,7 @@
       <w:r>
         <w:rPr>
           <w:rtl w:val="0"/>
+          <w:lang w:val="en-US"/>
         </w:rPr>
         <w:t>&lt;td&gt;Weaknesses&lt;/td&gt;</w:t>
       </w:r>
@@ -2075,6 +2251,7 @@
       <w:r>
         <w:rPr>
           <w:rtl w:val="0"/>
+          <w:lang w:val="en-US"/>
         </w:rPr>
         <w:t>&lt;td&gt;{slabiny}&lt;/td&gt;</w:t>
       </w:r>
@@ -2086,6 +2263,7 @@
       <w:r>
         <w:rPr>
           <w:rtl w:val="0"/>
+          <w:lang w:val="en-US"/>
         </w:rPr>
         <w:t>&lt;/tr&gt;</w:t>
       </w:r>
@@ -2097,6 +2275,7 @@
       <w:r>
         <w:rPr>
           <w:rtl w:val="0"/>
+          <w:lang w:val="en-US"/>
         </w:rPr>
         <w:t>&lt;tr&gt;</w:t>
       </w:r>
@@ -2108,6 +2287,7 @@
       <w:r>
         <w:rPr>
           <w:rtl w:val="0"/>
+          <w:lang w:val="en-US"/>
         </w:rPr>
         <w:t>&lt;td&gt;Combination&lt;/td&gt;</w:t>
       </w:r>
@@ -2119,6 +2299,7 @@
       <w:r>
         <w:rPr>
           <w:rtl w:val="0"/>
+          <w:lang w:val="en-US"/>
         </w:rPr>
         <w:t>&lt;td&gt;{doporucene_kombinace}&lt;/td&gt;</w:t>
       </w:r>
@@ -2130,6 +2311,7 @@
       <w:r>
         <w:rPr>
           <w:rtl w:val="0"/>
+          <w:lang w:val="en-US"/>
         </w:rPr>
         <w:t>&lt;/tr&gt;</w:t>
       </w:r>
@@ -2141,6 +2323,7 @@
       <w:r>
         <w:rPr>
           <w:rtl w:val="0"/>
+          <w:lang w:val="en-US"/>
         </w:rPr>
         <w:t>&lt;tr&gt;</w:t>
       </w:r>
@@ -2152,6 +2335,7 @@
       <w:r>
         <w:rPr>
           <w:rtl w:val="0"/>
+          <w:lang w:val="en-US"/>
         </w:rPr>
         <w:t>&lt;td&gt;Tip&lt;/td&gt;</w:t>
       </w:r>
@@ -2163,6 +2347,7 @@
       <w:r>
         <w:rPr>
           <w:rtl w:val="0"/>
+          <w:lang w:val="en-US"/>
         </w:rPr>
         <w:t>&lt;td&gt;{prakticky_tip}&lt;/td&gt;</w:t>
       </w:r>
@@ -2174,6 +2359,7 @@
       <w:r>
         <w:rPr>
           <w:rtl w:val="0"/>
+          <w:lang w:val="en-US"/>
         </w:rPr>
         <w:t>&lt;/tr&gt;</w:t>
       </w:r>
@@ -2185,6 +2371,7 @@
       <w:r>
         <w:rPr>
           <w:rtl w:val="0"/>
+          <w:lang w:val="en-US"/>
         </w:rPr>
         <w:t>&lt;/tbody&gt;</w:t>
       </w:r>
@@ -2196,6 +2383,7 @@
       <w:r>
         <w:rPr>
           <w:rtl w:val="0"/>
+          <w:lang w:val="en-US"/>
         </w:rPr>
         <w:t>&lt;/table&gt;</w:t>
       </w:r>
@@ -2207,6 +2395,7 @@
       <w:r>
         <w:rPr>
           <w:rtl w:val="0"/>
+          <w:lang w:val="en-US"/>
         </w:rPr>
         <w:t>&lt;/div&gt;</w:t>
       </w:r>
@@ -2218,6 +2407,7 @@
       <w:r>
         <w:rPr>
           <w:rtl w:val="0"/>
+          <w:lang w:val="en-US"/>
         </w:rPr>
         <w:t>&lt;/div&gt;</w:t>
       </w:r>
@@ -2234,6 +2424,7 @@
       <w:r>
         <w:rPr>
           <w:rtl w:val="0"/>
+          <w:lang w:val="en-US"/>
         </w:rPr>
         <w:t>&lt;!-- PACKAGE --&gt;</w:t>
       </w:r>
@@ -2245,6 +2436,7 @@
       <w:r>
         <w:rPr>
           <w:rtl w:val="0"/>
+          <w:lang w:val="en-US"/>
         </w:rPr>
         <w:t>&lt;div class="section"&gt;</w:t>
       </w:r>
@@ -2256,6 +2448,7 @@
       <w:r>
         <w:rPr>
           <w:rtl w:val="0"/>
+          <w:lang w:val="en-US"/>
         </w:rPr>
         <w:t>&lt;h2&gt;Package contents&lt;/h2&gt;</w:t>
       </w:r>
@@ -2267,6 +2460,7 @@
       <w:r>
         <w:rPr>
           <w:rtl w:val="0"/>
+          <w:lang w:val="en-US"/>
         </w:rPr>
         <w:t>&lt;div class="card-table"&gt;</w:t>
       </w:r>
@@ -2278,6 +2472,7 @@
       <w:r>
         <w:rPr>
           <w:rtl w:val="0"/>
+          <w:lang w:val="en-US"/>
         </w:rPr>
         <w:t>&lt;table&gt;</w:t>
       </w:r>
@@ -2289,6 +2484,7 @@
       <w:r>
         <w:rPr>
           <w:rtl w:val="0"/>
+          <w:lang w:val="en-US"/>
         </w:rPr>
         <w:t>&lt;tbody&gt;</w:t>
       </w:r>
@@ -2300,6 +2496,7 @@
       <w:r>
         <w:rPr>
           <w:rtl w:val="0"/>
+          <w:lang w:val="en-US"/>
         </w:rPr>
         <w:t>&lt;tr&gt;</w:t>
       </w:r>
@@ -2311,6 +2508,7 @@
       <w:r>
         <w:rPr>
           <w:rtl w:val="0"/>
+          <w:lang w:val="en-US"/>
         </w:rPr>
         <w:t>&lt;th&gt;Category&lt;/th&gt;</w:t>
       </w:r>
@@ -2322,6 +2520,7 @@
       <w:r>
         <w:rPr>
           <w:rtl w:val="0"/>
+          <w:lang w:val="en-US"/>
         </w:rPr>
         <w:t>&lt;th&gt;Contents&lt;/th&gt;</w:t>
       </w:r>
@@ -2333,6 +2532,7 @@
       <w:r>
         <w:rPr>
           <w:rtl w:val="0"/>
+          <w:lang w:val="en-US"/>
         </w:rPr>
         <w:t>&lt;/tr&gt;</w:t>
       </w:r>
@@ -2344,6 +2544,7 @@
       <w:r>
         <w:rPr>
           <w:rtl w:val="0"/>
+          <w:lang w:val="en-US"/>
         </w:rPr>
         <w:t>&lt;tr&gt;</w:t>
       </w:r>
@@ -2355,6 +2556,7 @@
       <w:r>
         <w:rPr>
           <w:rtl w:val="0"/>
+          <w:lang w:val="en-US"/>
         </w:rPr>
         <w:t>&lt;td&gt;Product&lt;/td&gt;</w:t>
       </w:r>
@@ -2366,6 +2568,7 @@
       <w:r>
         <w:rPr>
           <w:rtl w:val="0"/>
+          <w:lang w:val="en-US"/>
         </w:rPr>
         <w:t>&lt;td&gt;{obsah_produktu}&lt;/td&gt;</w:t>
       </w:r>
@@ -2377,6 +2580,7 @@
       <w:r>
         <w:rPr>
           <w:rtl w:val="0"/>
+          <w:lang w:val="en-US"/>
         </w:rPr>
         <w:t>&lt;/tr&gt;</w:t>
       </w:r>
@@ -2388,6 +2592,7 @@
       <w:r>
         <w:rPr>
           <w:rtl w:val="0"/>
+          <w:lang w:val="en-US"/>
         </w:rPr>
         <w:t>&lt;tr&gt;</w:t>
       </w:r>
@@ -2399,6 +2604,7 @@
       <w:r>
         <w:rPr>
           <w:rtl w:val="0"/>
+          <w:lang w:val="en-US"/>
         </w:rPr>
         <w:t>&lt;td&gt;Accessories&lt;/td&gt;</w:t>
       </w:r>
@@ -2410,6 +2616,7 @@
       <w:r>
         <w:rPr>
           <w:rtl w:val="0"/>
+          <w:lang w:val="en-US"/>
         </w:rPr>
         <w:t>&lt;td&gt;{doporucene_prislusenstvi}&lt;/td&gt;</w:t>
       </w:r>
@@ -2421,6 +2628,7 @@
       <w:r>
         <w:rPr>
           <w:rtl w:val="0"/>
+          <w:lang w:val="en-US"/>
         </w:rPr>
         <w:t>&lt;/tr&gt;</w:t>
       </w:r>
@@ -2432,6 +2640,7 @@
       <w:r>
         <w:rPr>
           <w:rtl w:val="0"/>
+          <w:lang w:val="en-US"/>
         </w:rPr>
         <w:t>&lt;/tbody&gt;</w:t>
       </w:r>
@@ -2443,6 +2652,7 @@
       <w:r>
         <w:rPr>
           <w:rtl w:val="0"/>
+          <w:lang w:val="en-US"/>
         </w:rPr>
         <w:t>&lt;/table&gt;</w:t>
       </w:r>
@@ -2454,6 +2664,7 @@
       <w:r>
         <w:rPr>
           <w:rtl w:val="0"/>
+          <w:lang w:val="en-US"/>
         </w:rPr>
         <w:t>&lt;/div&gt;</w:t>
       </w:r>
@@ -2465,6 +2676,7 @@
       <w:r>
         <w:rPr>
           <w:rtl w:val="0"/>
+          <w:lang w:val="en-US"/>
         </w:rPr>
         <w:t>&lt;/div&gt;</w:t>
       </w:r>
@@ -2482,6 +2694,50 @@
         <w:rPr>
           <w:rtl w:val="0"/>
         </w:rPr>
+        <w:t>&lt;!-- TECHNICAL INFORMATION --&gt;</w:t>
+      </w:r>
+    </w:p>
+    <w:p>
+      <w:pPr>
+        <w:pStyle w:val="Text A"/>
+      </w:pPr>
+      <w:r>
+        <w:rPr>
+          <w:rtl w:val="0"/>
+        </w:rPr>
+        <w:t>&lt;div class="section"&gt;</w:t>
+      </w:r>
+    </w:p>
+    <w:p>
+      <w:pPr>
+        <w:pStyle w:val="Text A"/>
+      </w:pPr>
+      <w:r>
+        <w:rPr>
+          <w:rtl w:val="0"/>
+        </w:rPr>
+        <w:t>&lt;h2&gt;Technical Information&lt;/h2&gt;</w:t>
+      </w:r>
+    </w:p>
+    <w:p>
+      <w:pPr>
+        <w:pStyle w:val="Text A"/>
+      </w:pPr>
+      <w:r>
+        <w:rPr>
+          <w:rtl w:val="0"/>
+        </w:rPr>
+        <w:t>&lt;div class="card-table"&gt;</w:t>
+      </w:r>
+    </w:p>
+    <w:p>
+      <w:pPr>
+        <w:pStyle w:val="Text A"/>
+      </w:pPr>
+      <w:r>
+        <w:rPr>
+          <w:rtl w:val="0"/>
+        </w:rPr>
         <w:t>&lt;table&gt;</w:t>
       </w:r>
     </w:p>
@@ -2515,6 +2771,50 @@
         <w:rPr>
           <w:rtl w:val="0"/>
         </w:rPr>
+        <w:t>&lt;th&gt;Category&lt;/th&gt;</w:t>
+      </w:r>
+    </w:p>
+    <w:p>
+      <w:pPr>
+        <w:pStyle w:val="Text A"/>
+      </w:pPr>
+      <w:r>
+        <w:rPr>
+          <w:rtl w:val="0"/>
+        </w:rPr>
+        <w:t>&lt;th&gt;Value&lt;/th&gt;</w:t>
+      </w:r>
+    </w:p>
+    <w:p>
+      <w:pPr>
+        <w:pStyle w:val="Text A"/>
+      </w:pPr>
+      <w:r>
+        <w:rPr>
+          <w:rtl w:val="0"/>
+        </w:rPr>
+        <w:t>&lt;/tr&gt;</w:t>
+      </w:r>
+    </w:p>
+    <w:p>
+      <w:pPr>
+        <w:pStyle w:val="Text A"/>
+      </w:pPr>
+      <w:r>
+        <w:rPr>
+          <w:rtl w:val="0"/>
+        </w:rPr>
+        <w:t>&lt;tr&gt;</w:t>
+      </w:r>
+    </w:p>
+    <w:p>
+      <w:pPr>
+        <w:pStyle w:val="Text A"/>
+      </w:pPr>
+      <w:r>
+        <w:rPr>
+          <w:rtl w:val="0"/>
+        </w:rPr>
         <w:t>&lt;td&gt;Type&lt;/td&gt;</w:t>
       </w:r>
     </w:p>
@@ -2691,30 +2991,18 @@
         <w:rPr>
           <w:rtl w:val="0"/>
         </w:rPr>
-        <w:t>&lt;td&gt;Special features&lt;/td&gt;</w:t>
-      </w:r>
-    </w:p>
-    <w:p>
-      <w:pPr>
-        <w:pStyle w:val="Text A"/>
-      </w:pPr>
-      <w:r>
-        <w:rPr>
-          <w:rtl w:val="0"/>
-        </w:rPr>
-        <w:t>&lt;td&gt;{speci</w:t>
-      </w:r>
-      <w:r>
-        <w:rPr>
-          <w:rtl w:val="0"/>
-        </w:rPr>
-        <w:t>á</w:t>
-      </w:r>
-      <w:r>
-        <w:rPr>
-          <w:rtl w:val="0"/>
-        </w:rPr>
-        <w:t>lni_vlastnosti}&lt;/td&gt;</w:t>
+        <w:t>&lt;td&gt;Special Features&lt;/td&gt;</w:t>
+      </w:r>
+    </w:p>
+    <w:p>
+      <w:pPr>
+        <w:pStyle w:val="Text A"/>
+      </w:pPr>
+      <w:r>
+        <w:rPr>
+          <w:rtl w:val="0"/>
+        </w:rPr>
+        <w:t>&lt;td&gt;{specialni_vlastnosti}&lt;/td&gt;</w:t>
       </w:r>
     </w:p>
     <w:p>
@@ -2748,6 +3036,28 @@
           <w:rtl w:val="0"/>
         </w:rPr>
         <w:t>&lt;/table&gt;</w:t>
+      </w:r>
+    </w:p>
+    <w:p>
+      <w:pPr>
+        <w:pStyle w:val="Text A"/>
+      </w:pPr>
+      <w:r>
+        <w:rPr>
+          <w:rtl w:val="0"/>
+        </w:rPr>
+        <w:t>&lt;/div&gt;</w:t>
+      </w:r>
+    </w:p>
+    <w:p>
+      <w:pPr>
+        <w:pStyle w:val="Text A"/>
+      </w:pPr>
+      <w:r>
+        <w:rPr>
+          <w:rtl w:val="0"/>
+        </w:rPr>
+        <w:t>&lt;/div&gt;</w:t>
       </w:r>
     </w:p>
     <w:sectPr>

</xml_diff>